<commit_message>
Sprint 6 en cero con el reparto por historia completa; Burndown S4-S5, ceremonias del S5 y plan de pruebas al dia
Co-Authored-By: Claude Sonnet 5.5 <noreply@anthropic.com>
</commit_message>
<xml_diff>
--- a/Fase 2/Evidencias Proyecto/Ceremonias/SIGMA_Sprint_Retrospective_Sprint_5.docx
+++ b/Fase 2/Evidencias Proyecto/Ceremonias/SIGMA_Sprint_Retrospective_Sprint_5.docx
@@ -120,7 +120,39 @@
               <w:rPr>
                 <w:sz w:val="20"/>
               </w:rPr>
-              <w:t>A completar en la reunión</w:t>
+              <w:t>10-11-2026 · 1 h</w:t>
+            </w:r>
+          </w:p>
+        </w:tc>
+      </w:tr>
+      <w:tr>
+        <w:tc>
+          <w:tcPr>
+            <w:tcW w:type="dxa" w:w="2551"/>
+            <w:shd w:val="clear" w:color="auto" w:fill="F3F1FB"/>
+          </w:tcPr>
+          <w:p>
+            <w:r/>
+            <w:r>
+              <w:rPr>
+                <w:b/>
+                <w:sz w:val="20"/>
+              </w:rPr>
+              <w:t>Lugar</w:t>
+            </w:r>
+          </w:p>
+        </w:tc>
+        <w:tc>
+          <w:tcPr>
+            <w:tcW w:type="dxa" w:w="6803"/>
+          </w:tcPr>
+          <w:p>
+            <w:r/>
+            <w:r>
+              <w:rPr>
+                <w:sz w:val="20"/>
+              </w:rPr>
+              <w:t>Videollamada</w:t>
             </w:r>
           </w:p>
         </w:tc>

</xml_diff>